<commit_message>
Clarify Gujarat procurement position and research gap with verified sources
State that FCI does not undertake procurement in Gujarat (per RO Ahmedabad)
and that in-state MSP procurement is done by the Government of Gujarat via
GSCSC; identify the dataset's coarse grain series as state procurement.
Scope research-gap claims to the studies reviewed, add Kumar et al. (2023)
and PIB (2024), and cross-check transit loss, interest and equity figures.

Co-Authored-By: Claude Opus 5.5 <noreply@anthropic.com>
Claude-Session: https://claude.ai/code/session_01RKv2yeXcauXHLj6Hje8Eo5
</commit_message>
<xml_diff>
--- a/minor-project/FCI_Minor_Project_Report.docx
+++ b/minor-project/FCI_Minor_Project_Report.docx
@@ -2292,7 +2292,7 @@
       </w:pPr>
       <w:r>
         <w:rPr/>
-        <w:t xml:space="preserve">National procurement recovered to 559 lakh metric tonnes (LMT) in 2024-25 but remained 2.9% below 2022-23. Storage capacity grew 36% over three years, almost entirely through hired warehousing, while average utilisation improved from 64% to 84%. Total foodgrain movement fell 28%. The Gujarat Region does not procure grain; its role is storage and distribution. Its storage capacity has grown by about 50% since 2019-20 (6.23 LMT to 9.34 LMT), utilisation was about 91% in the latest years reported, and foodgrain offtake rose 18.6% between 2022-23 and 2024-25.</w:t>
+        <w:t xml:space="preserve">National procurement recovered to 559 lakh metric tonnes (LMT) in 2024-25 but remained 2.9% below 2022-23. Storage capacity grew 36% over three years, almost entirely through hired warehousing, while average utilisation improved from 64% to 84%. Total foodgrain movement fell 28%. FCI does not undertake procurement in Gujarat (MSP procurement in the state is carried out by the Government of Gujarat through the Gujarat State Civil Supplies Corporation); the role of FCI’s Gujarat Region is storage and distribution. Its storage capacity has grown by about 50% since 2019-20 (6.23 LMT to 9.34 LMT), utilisation was about 91% in the latest years reported, and foodgrain offtake rose 18.6% between 2022-23 and 2024-25.</w:t>
       </w:r>
     </w:p>
     <w:p>
@@ -2703,7 +2703,7 @@
               <w:rFonts w:ascii="Times New Roman" w:hAnsi="Times New Roman" w:cs="Times New Roman"/>
               <w:noProof/>
             </w:rPr>
-            <w:t>17</w:t>
+            <w:t>18</w:t>
           </w:r>
         </w:p>
         <w:p>
@@ -2733,7 +2733,7 @@
               <w:rFonts w:ascii="Times New Roman" w:hAnsi="Times New Roman" w:cs="Times New Roman"/>
               <w:noProof/>
             </w:rPr>
-            <w:t>19</w:t>
+            <w:t>21</w:t>
           </w:r>
         </w:p>
         <w:p>
@@ -2763,7 +2763,7 @@
               <w:rFonts w:ascii="Times New Roman" w:hAnsi="Times New Roman" w:cs="Times New Roman"/>
               <w:noProof/>
             </w:rPr>
-            <w:t>31</w:t>
+            <w:t>33</w:t>
           </w:r>
         </w:p>
         <w:p>
@@ -2793,7 +2793,7 @@
               <w:rFonts w:ascii="Times New Roman" w:hAnsi="Times New Roman" w:cs="Times New Roman"/>
               <w:noProof/>
             </w:rPr>
-            <w:t>33</w:t>
+            <w:t>35</w:t>
           </w:r>
         </w:p>
         <w:p>
@@ -2823,7 +2823,7 @@
               <w:rFonts w:ascii="Times New Roman" w:hAnsi="Times New Roman" w:cs="Times New Roman"/>
               <w:noProof/>
             </w:rPr>
-            <w:t>34</w:t>
+            <w:t>36</w:t>
           </w:r>
         </w:p>
         <w:p>
@@ -2853,7 +2853,7 @@
               <w:rFonts w:ascii="Times New Roman" w:hAnsi="Times New Roman" w:cs="Times New Roman"/>
               <w:noProof/>
             </w:rPr>
-            <w:t>35</w:t>
+            <w:t>37</w:t>
           </w:r>
         </w:p>
         <w:p>
@@ -3870,12 +3870,6 @@
           <w:color w:val="156082" w:themeColor="accent1"/>
         </w:rPr>
       </w:pPr>
-      <w:r>
-        <w:rPr>
-          <w:rFonts w:ascii="Times New Roman" w:hAnsi="Times New Roman" w:cs="Times New Roman"/>
-        </w:rPr>
-        <w:t>Gujarat is not a “high-distress” rice-consuming state such as Jharkhand or Odisha, or a top wheat-producing state like Punjab and Haryana. Per direct confirmation from FCI's Regional Office, Ahmedabad, Gujarat Region is not a procuring region: its core functions are the storage of central pool stock and distribution under the National Food Security Act (NFSA) and other welfare schemes to its urban and semi-urban population. Notably, FSD Mehsana (Gujarat) bagged 2nd position at all India level for best operational unit in Special Campaign 4.0 (2025) for cleanliness.</w:t>
-      </w:r>
       <w:sdt>
         <w:sdtPr>
           <w:rPr>
@@ -3925,6 +3919,12 @@
           </w:r>
         </w:sdtContent>
       </w:sdt>
+      <w:r>
+        <w:rPr>
+          <w:rFonts w:ascii="Times New Roman" w:hAnsi="Times New Roman" w:cs="Times New Roman"/>
+        </w:rPr>
+        <w:t xml:space="preserve">As confirmed by FCI’s Regional Office, Ahmedabad, FCI does not undertake foodgrain procurement in Gujarat. The core functions of the Gujarat Region are the storage of central pool stock and its distribution under the National Food Security Act (NFSA) and other welfare schemes. Where MSP procurement does take place within the state — for example of bajra, jowar, maize and paddy — it is carried out by the Government of Gujarat through its nodal agency, the Gujarat State Civil Supplies Corporation Ltd. (GSCSC), not by FCI (GSCSC, n.d.; ANI, 2025). Notably, FSD Mehsana (Gujarat) secured 2nd position at the all-India level for best operational unit in Special Campaign 4.0 (2025) for cleanliness (FCI, 2026).</w:t>
+      </w:r>
     </w:p>
     <w:tbl>
       <w:tblPr>
@@ -4217,7 +4217,7 @@
                 <w:rFonts w:ascii="Times New Roman" w:eastAsia="Times New Roman" w:hAnsi="Times New Roman" w:cs="Times New Roman"/>
                 <w:color w:val="000000"/>
               </w:rPr>
-              <w:t>Storage of central pool stock; distribution under NFSA/PDS and allied welfare schemes (not a procuring region)</w:t>
+              <w:t xml:space="preserve">Storage of central pool stock; distribution under NFSA/PDS and allied welfare schemes (FCI does not undertake procurement in Gujarat)</w:t>
             </w:r>
           </w:p>
         </w:tc>
@@ -5934,7 +5934,7 @@
         <w:rPr>
           <w:rFonts w:ascii="Times New Roman" w:eastAsia="Times New Roman" w:hAnsi="Times New Roman" w:cs="Times New Roman"/>
         </w:rPr>
-        <w:t xml:space="preserve">Gujarat is a consuming rather than a procuring region in FCI’s network. As confirmed by FCI’s Regional Office, Ahmedabad, the Gujarat Region does not conduct grain procurement; its role is to store central pool stock received from surplus states and to issue it under NFSA, the Public Distribution System and other welfare schemes. The performance of the Gujarat Region is therefore best judged through storage and distribution indicators rather than procurement.</w:t>
+        <w:t xml:space="preserve">Gujarat differs from the major procuring states in FCI’s network. As confirmed by FCI’s Regional Office, Ahmedabad, FCI does not undertake procurement in Gujarat; its Gujarat Region stores central pool stock received from other states and issues it under NFSA, the Public Distribution System and other welfare schemes. MSP procurement that does take place within Gujarat is carried out by the State Government through GSCSC, the state’s nodal agency for purchasing foodgrains at MSP (GSCSC, n.d.). For example, Gujarat’s procurement of maize and bajra in KMS 2022-23 was reported at about 766 tonnes against an approved quantity of 30,000 tonnes (Krishi Jagran, 2023). The performance of FCI’s Gujarat Region is therefore best judged through storage and distribution indicators rather than procurement.</w:t>
       </w:r>
     </w:p>
     <w:p>
@@ -5976,7 +5976,7 @@
         <w:rPr>
           <w:rFonts w:ascii="Times New Roman" w:hAnsi="Times New Roman" w:cs="Times New Roman"/>
         </w:rPr>
-        <w:t xml:space="preserve">To identify the research gap, the main existing studies on FCI and on business analytics were compared on three points: the period they cover, the geographic level they analyse, and whether they use a KPI-based performance framework. Table 3.1 summarises this comparison.</w:t>
+        <w:t xml:space="preserve">To identify the research gap, the main existing studies on FCI and on business analytics were compared on three points: the period they cover, the geographic level they analyse, and whether they use a KPI-based performance framework. Table 3.1 summarises this comparison. The review is limited to the studies listed and is not a systematic search of all published work.</w:t>
       </w:r>
     </w:p>
     <w:tbl>
@@ -6356,7 +6356,7 @@
                 <w:rFonts w:ascii="Times New Roman" w:hAnsi="Times New Roman" w:cs="Times New Roman"/>
                 <w:sz w:val="22"/>
               </w:rPr>
-              <w:t xml:space="preserve">Turban et al. (2011); Chen, Chiang and Storey (2012)</w:t>
+              <w:t xml:space="preserve">Kumar, Dey and Gupta (2023)</w:t>
             </w:r>
           </w:p>
         </w:tc>
@@ -6377,7 +6377,7 @@
                 <w:rFonts w:ascii="Times New Roman" w:hAnsi="Times New Roman" w:cs="Times New Roman"/>
                 <w:sz w:val="22"/>
               </w:rPr>
-              <w:t xml:space="preserve">Concepts and methods of business intelligence and analytics</w:t>
+              <w:t xml:space="preserve">Management case study on making FCI’s public procurement more inclusive and efficient</w:t>
             </w:r>
           </w:p>
         </w:tc>
@@ -6398,7 +6398,7 @@
                 <w:rFonts w:ascii="Times New Roman" w:hAnsi="Times New Roman" w:cs="Times New Roman"/>
                 <w:sz w:val="22"/>
               </w:rPr>
-              <w:t xml:space="preserve">General / private sector</w:t>
+              <w:t xml:space="preserve">Procurement operations</w:t>
             </w:r>
           </w:p>
         </w:tc>
@@ -6419,7 +6419,7 @@
                 <w:rFonts w:ascii="Times New Roman" w:hAnsi="Times New Roman" w:cs="Times New Roman"/>
                 <w:sz w:val="22"/>
               </w:rPr>
-              <w:t xml:space="preserve">Not applied to FCI or to any public food distribution agency</w:t>
+              <w:t xml:space="preserve">Covers procurement only; no storage, distribution or financial KPIs; no Gujarat analysis</w:t>
             </w:r>
           </w:p>
         </w:tc>
@@ -6442,6 +6442,92 @@
                 <w:rFonts w:ascii="Times New Roman" w:hAnsi="Times New Roman" w:cs="Times New Roman"/>
                 <w:sz w:val="22"/>
               </w:rPr>
+              <w:t xml:space="preserve">Turban et al. (2011); Chen, Chiang and Storey (2012)</w:t>
+            </w:r>
+          </w:p>
+        </w:tc>
+        <w:tc>
+          <w:tcPr>
+            <w:tcW w:w="2700" w:type="dxa"/>
+          </w:tcPr>
+          <w:p>
+            <w:pPr>
+              <w:spacing w:line="276" w:lineRule="auto"/>
+              <w:rPr>
+                <w:rFonts w:ascii="Times New Roman" w:hAnsi="Times New Roman" w:cs="Times New Roman"/>
+                <w:sz w:val="22"/>
+              </w:rPr>
+            </w:pPr>
+            <w:r>
+              <w:rPr>
+                <w:rFonts w:ascii="Times New Roman" w:hAnsi="Times New Roman" w:cs="Times New Roman"/>
+                <w:sz w:val="22"/>
+              </w:rPr>
+              <w:t xml:space="preserve">Concepts and methods of business intelligence and analytics</w:t>
+            </w:r>
+          </w:p>
+        </w:tc>
+        <w:tc>
+          <w:tcPr>
+            <w:tcW w:w="1500" w:type="dxa"/>
+          </w:tcPr>
+          <w:p>
+            <w:pPr>
+              <w:spacing w:line="276" w:lineRule="auto"/>
+              <w:rPr>
+                <w:rFonts w:ascii="Times New Roman" w:hAnsi="Times New Roman" w:cs="Times New Roman"/>
+                <w:sz w:val="22"/>
+              </w:rPr>
+            </w:pPr>
+            <w:r>
+              <w:rPr>
+                <w:rFonts w:ascii="Times New Roman" w:hAnsi="Times New Roman" w:cs="Times New Roman"/>
+                <w:sz w:val="22"/>
+              </w:rPr>
+              <w:t xml:space="preserve">General / private sector</w:t>
+            </w:r>
+          </w:p>
+        </w:tc>
+        <w:tc>
+          <w:tcPr>
+            <w:tcW w:w="3019" w:type="dxa"/>
+          </w:tcPr>
+          <w:p>
+            <w:pPr>
+              <w:spacing w:line="276" w:lineRule="auto"/>
+              <w:rPr>
+                <w:rFonts w:ascii="Times New Roman" w:hAnsi="Times New Roman" w:cs="Times New Roman"/>
+                <w:sz w:val="22"/>
+              </w:rPr>
+            </w:pPr>
+            <w:r>
+              <w:rPr>
+                <w:rFonts w:ascii="Times New Roman" w:hAnsi="Times New Roman" w:cs="Times New Roman"/>
+                <w:sz w:val="22"/>
+              </w:rPr>
+              <w:t xml:space="preserve">Not applied to FCI or to any public food distribution agency</w:t>
+            </w:r>
+          </w:p>
+        </w:tc>
+      </w:tr>
+      <w:tr>
+        <w:tc>
+          <w:tcPr>
+            <w:tcW w:w="1900" w:type="dxa"/>
+          </w:tcPr>
+          <w:p>
+            <w:pPr>
+              <w:spacing w:line="276" w:lineRule="auto"/>
+              <w:rPr>
+                <w:rFonts w:ascii="Times New Roman" w:hAnsi="Times New Roman" w:cs="Times New Roman"/>
+                <w:sz w:val="22"/>
+              </w:rPr>
+            </w:pPr>
+            <w:r>
+              <w:rPr>
+                <w:rFonts w:ascii="Times New Roman" w:hAnsi="Times New Roman" w:cs="Times New Roman"/>
+                <w:sz w:val="22"/>
+              </w:rPr>
               <w:t xml:space="preserve">FCI Annual Reports (2022-23 to 2024-25)</w:t>
             </w:r>
           </w:p>
@@ -6506,6 +6592,92 @@
                 <w:sz w:val="22"/>
               </w:rPr>
               <w:t xml:space="preserve">Present data year by year; no multi-year KPI comparison and no region-level financial analysis</w:t>
+            </w:r>
+          </w:p>
+        </w:tc>
+      </w:tr>
+      <w:tr>
+        <w:tc>
+          <w:tcPr>
+            <w:tcW w:w="1900" w:type="dxa"/>
+          </w:tcPr>
+          <w:p>
+            <w:pPr>
+              <w:spacing w:line="276" w:lineRule="auto"/>
+              <w:rPr>
+                <w:rFonts w:ascii="Times New Roman" w:hAnsi="Times New Roman" w:cs="Times New Roman"/>
+                <w:sz w:val="22"/>
+              </w:rPr>
+            </w:pPr>
+            <w:r>
+              <w:rPr>
+                <w:rFonts w:ascii="Times New Roman" w:hAnsi="Times New Roman" w:cs="Times New Roman"/>
+                <w:sz w:val="22"/>
+              </w:rPr>
+              <w:t xml:space="preserve">PIB (2024)</w:t>
+            </w:r>
+          </w:p>
+        </w:tc>
+        <w:tc>
+          <w:tcPr>
+            <w:tcW w:w="2700" w:type="dxa"/>
+          </w:tcPr>
+          <w:p>
+            <w:pPr>
+              <w:spacing w:line="276" w:lineRule="auto"/>
+              <w:rPr>
+                <w:rFonts w:ascii="Times New Roman" w:hAnsi="Times New Roman" w:cs="Times New Roman"/>
+                <w:sz w:val="22"/>
+              </w:rPr>
+            </w:pPr>
+            <w:r>
+              <w:rPr>
+                <w:rFonts w:ascii="Times New Roman" w:hAnsi="Times New Roman" w:cs="Times New Roman"/>
+                <w:sz w:val="22"/>
+              </w:rPr>
+              <w:t xml:space="preserve">Government summary of FCI reforms and selected results up to 2023-24</w:t>
+            </w:r>
+          </w:p>
+        </w:tc>
+        <w:tc>
+          <w:tcPr>
+            <w:tcW w:w="1500" w:type="dxa"/>
+          </w:tcPr>
+          <w:p>
+            <w:pPr>
+              <w:spacing w:line="276" w:lineRule="auto"/>
+              <w:rPr>
+                <w:rFonts w:ascii="Times New Roman" w:hAnsi="Times New Roman" w:cs="Times New Roman"/>
+                <w:sz w:val="22"/>
+              </w:rPr>
+            </w:pPr>
+            <w:r>
+              <w:rPr>
+                <w:rFonts w:ascii="Times New Roman" w:hAnsi="Times New Roman" w:cs="Times New Roman"/>
+                <w:sz w:val="22"/>
+              </w:rPr>
+              <w:t xml:space="preserve">National</w:t>
+            </w:r>
+          </w:p>
+        </w:tc>
+        <w:tc>
+          <w:tcPr>
+            <w:tcW w:w="3019" w:type="dxa"/>
+          </w:tcPr>
+          <w:p>
+            <w:pPr>
+              <w:spacing w:line="276" w:lineRule="auto"/>
+              <w:rPr>
+                <w:rFonts w:ascii="Times New Roman" w:hAnsi="Times New Roman" w:cs="Times New Roman"/>
+                <w:sz w:val="22"/>
+              </w:rPr>
+            </w:pPr>
+            <w:r>
+              <w:rPr>
+                <w:rFonts w:ascii="Times New Roman" w:hAnsi="Times New Roman" w:cs="Times New Roman"/>
+                <w:sz w:val="22"/>
+              </w:rPr>
+              <w:t xml:space="preserve">Official summary of achievements, not an independent multi-year performance analysis; no regional analysis</w:t>
             </w:r>
           </w:p>
         </w:tc>
@@ -6567,7 +6739,7 @@
         <w:rPr>
           <w:rFonts w:ascii="Times New Roman" w:hAnsi="Times New Roman" w:cs="Times New Roman"/>
         </w:rPr>
-        <w:t xml:space="preserve"> None of the reviewed studies covers the post-COVID years 2022-23 to 2024-25 or compares them with the pre-COVID baseline of 2019-20. The most recent independent review of FCI, the CAG audit of 2023, ends at 2021-22.</w:t>
+        <w:t xml:space="preserve"> Among the studies reviewed, none analyses FCI’s performance over the post-COVID years 2022-23 to 2024-25 in a consistent framework or compares them with the pre-COVID baseline of 2019-20. The most recent independent review, the CAG audit (2023), ends at 2021-22, and the PIB (2024) note reports selected results only.</w:t>
       </w:r>
     </w:p>
     <w:p>
@@ -6591,7 +6763,7 @@
         <w:rPr>
           <w:rFonts w:ascii="Times New Roman" w:hAnsi="Times New Roman" w:cs="Times New Roman"/>
         </w:rPr>
-        <w:t xml:space="preserve"> Existing studies look at FCI at the national level. None examines Gujarat, a non-procuring region whose role is limited to storing and distributing grain procured elsewhere.</w:t>
+        <w:t xml:space="preserve"> The studies reviewed analyse FCI at the national level or focus on procurement. None examines Gujarat, where FCI does not undertake procurement and its role is limited to storing and distributing grain procured elsewhere.</w:t>
       </w:r>
     </w:p>
     <w:p>
@@ -6615,7 +6787,7 @@
         <w:rPr>
           <w:rFonts w:ascii="Times New Roman" w:hAnsi="Times New Roman" w:cs="Times New Roman"/>
         </w:rPr>
-        <w:t xml:space="preserve"> Earlier work is either an audit of past lapses or a descriptive overview of FCI’s functions. None tracks FCI’s performance through one consistent set of KPIs across procurement, storage, distribution, finance and losses.</w:t>
+        <w:t xml:space="preserve"> Earlier work is either an audit of past lapses or a descriptive overview of FCI’s functions. None of the studies reviewed tracks FCI’s performance through one consistent set of KPIs across procurement, storage, distribution, finance and losses.</w:t>
       </w:r>
     </w:p>
     <w:p>
@@ -6889,7 +7061,7 @@
                 <w:sz w:val="22"/>
                 <w:szCs w:val="22"/>
               </w:rPr>
-              <w:t xml:space="preserve">Understanding the Gujarat Region’s role (e.g., that it does not procure grain)</w:t>
+              <w:t xml:space="preserve">Understanding the Gujarat Region’s role (e.g., that FCI does not undertake procurement in Gujarat)</w:t>
             </w:r>
           </w:p>
         </w:tc>
@@ -8098,6 +8270,27 @@
           <w:rFonts w:ascii="Times New Roman" w:eastAsia="Times New Roman" w:hAnsi="Times New Roman" w:cs="Times New Roman"/>
         </w:rPr>
         <w:t xml:space="preserve">Some values in the compiled dataset (for example, 2019-20 national procurement, sales and movement volumes, and several Gujarat figures) appear inconsistent or carried forward from the previous year; these have been excluded or flagged rather than used as reported.</w:t>
+      </w:r>
+    </w:p>
+    <w:p>
+      <w:pPr>
+        <w:pStyle w:val="ListParagraph"/>
+        <w:numPr>
+          <w:ilvl w:val="0"/>
+          <w:numId w:val="8"/>
+        </w:numPr>
+        <w:spacing w:line="360" w:lineRule="auto"/>
+        <w:contextualSpacing w:val="0"/>
+        <w:jc w:val="both"/>
+        <w:rPr>
+          <w:rFonts w:ascii="Times New Roman" w:hAnsi="Times New Roman" w:cs="Times New Roman"/>
+        </w:rPr>
+      </w:pPr>
+      <w:r>
+        <w:rPr>
+          <w:rFonts w:ascii="Times New Roman" w:eastAsia="Times New Roman" w:hAnsi="Times New Roman" w:cs="Times New Roman"/>
+        </w:rPr>
+        <w:t xml:space="preserve">The literature review covers a limited set of studies and is not a systematic review.</w:t>
       </w:r>
     </w:p>
     <w:p>
@@ -10575,7 +10768,7 @@
         <w:rPr>
           <w:rFonts w:ascii="Times New Roman" w:eastAsia="Times New Roman" w:hAnsi="Times New Roman" w:cs="Times New Roman"/>
         </w:rPr>
-        <w:t xml:space="preserve">The Gujarat Region does not conduct grain procurement — a point confirmed by FCI’s Regional Office, Ahmedabad, and consistent with the region’s recorded purchases, which are nil in every year except a negligible 1,629 tonnes in 2020-21. Its role is storage and distribution. Total storage capacity grew from 6.23 LMT in 2019-20 to 9.34 LMT in recent years, an increase of about 50%, and utilisation was reported at about 91% in the latest years available. Foodgrain offtake rose from 23.18 lakh tonnes in 2022-23 to 27.50 lakh tonnes in 2024-25 (+18.6%), while closing stock rose from 7.65 to 9.32 lakh tonnes (+21.8%). Closing stock therefore grew slightly faster than offtake, but at the end of 2024-25 it was still equal to only about four months of offtake (9.32 ÷ 27.50 × 12 ≈ 4.1 months), which does not suggest a serious build-up of surplus stock. A fuller assessment of distribution efficiency would need depot-level and fair price shop data, which is not published.</w:t>
+        <w:t xml:space="preserve">FCI does not undertake procurement in Gujarat — a point confirmed by FCI’s Regional Office, Ahmedabad. In the compiled dataset, the ‘Purchases/Procurement’ line of the region’s foodgrain account is nil in five of the six years; the only entry, 1,629 tonnes in 2020-21 (less than 0.05% of that year’s offtake), could not be verified and is not treated as procurement in this study. The region’s role is storage and distribution. Total storage capacity grew from 6.23 LMT in 2019-20 to 9.34 LMT in recent years, an increase of about 50%, and utilisation was reported at about 91% in the latest years available. Foodgrain offtake rose from 23.18 lakh tonnes in 2022-23 to 27.50 lakh tonnes in 2024-25 (+18.6%), while closing stock rose from 7.65 to 9.32 lakh tonnes (+21.8%). Closing stock therefore grew slightly faster than offtake, but at the end of 2024-25 it was still equal to only about four months of offtake (9.32 ÷ 27.50 × 12 ≈ 4.1 months), which does not suggest a serious build-up of surplus stock. A fuller assessment of distribution efficiency would need depot-level and fair price shop data, which is not published.</w:t>
       </w:r>
     </w:p>
     <w:p>
@@ -10599,7 +10792,7 @@
         <w:rPr>
           <w:rFonts w:ascii="Times New Roman" w:eastAsia="Times New Roman" w:hAnsi="Times New Roman" w:cs="Times New Roman"/>
         </w:rPr>
-        <w:t xml:space="preserve">A note on data quality: the compiled dataset also contains a coarse grain (Bajra, Jowar, Ragi) procurement series for Gujarat. Since the Regional Office confirmed that Gujarat does not procure grain, and the region’s own transaction data shows nil purchases, this series is not used in this study. It may relate to procurement by state agencies rather than FCI, but this could not be confirmed. This shows why secondary data should be checked against an organisation’s actual operations before it is analysed.</w:t>
+        <w:t xml:space="preserve">A note on data: the compiled dataset also contains a coarse grain (bajra, jowar, maize, ragi) procurement series on its Gujarat sheet. This is not FCI procurement. MSP procurement of coarse grains in Gujarat is carried out by the Government of Gujarat through GSCSC (GSCSC, n.d.; ANI, 2025), and the dataset’s 2022-23 total (766 tonnes) matches the quantity reported for Gujarat’s maize and bajra procurement in KMS 2022-23 (Krishi Jagran, 2023). The series therefore reflects state-agency procurement and is excluded from the analysis of FCI’s Gujarat Region. This shows why secondary data should be checked against an organisation’s actual operations before it is analysed.</w:t>
       </w:r>
     </w:p>
     <w:p>
@@ -18629,7 +18822,7 @@
         <w:rPr>
           <w:rFonts w:ascii="Times New Roman" w:eastAsia="Times New Roman" w:hAnsi="Times New Roman" w:cs="Times New Roman"/>
         </w:rPr>
-        <w:t xml:space="preserve">Storage cost fell from ₹2,91,285 lakh in 2022-23 to ₹2,47,264 lakh in 2023-24, but then rose 62.7% in a single year to ₹4,02,338 lakh in 2024-25, in line with the growth in hired storage and higher stock levels. Interest cost rose 30.9% year-on-year in 2024-25, and employee cost grew at a moderate 8.9% CAGR.</w:t>
+        <w:t xml:space="preserve">Storage cost fell from ₹2,91,285 lakh in 2022-23 to ₹2,47,264 lakh in 2023-24, but then rose 62.7% in a single year to ₹4,02,338 lakh in 2024-25, in line with the growth in hired storage and higher stock levels. Interest cost fell in 2023-24 (to about ₹3,268 crore from ₹3,679 crore, figures that match those published by the Government; PIB, 2024) but rose 30.9% in 2024-25. Employee cost grew at a moderate 8.9% CAGR.</w:t>
       </w:r>
     </w:p>
     <w:p>
@@ -21170,7 +21363,7 @@
         <w:rPr>
           <w:rFonts w:ascii="Times New Roman" w:eastAsia="Times New Roman" w:hAnsi="Times New Roman" w:cs="Times New Roman"/>
         </w:rPr>
-        <w:t xml:space="preserve">Transit losses fell from 0.22% of movement in 2022-23 to 0.17% in 2024-25, a positive trend that is likely supported by measures such as electronic weighbridges, CCTV surveillance and better-quality gunny bags. In 2024-25 FCI also recorded a net storage gain of 0.66 LMT, valued at about ₹90 crore.</w:t>
+        <w:t xml:space="preserve">Transit losses fell from 0.22% of movement in 2022-23 to 0.17% in 2024-25. The 2023-24 figure of 0.16% matches the figure published by the Government of India, which attributes the improvement partly to tamper-proof, high-security cable seals used on rakes from 1 January 2023 and reports a 96% reduction in the number of rakes with transit losses above 0.5% (PIB, 2024). In 2024-25 FCI also recorded a net storage gain of 0.66 LMT, valued at about ₹90 crore.</w:t>
       </w:r>
     </w:p>
     <w:p>
@@ -22281,7 +22474,7 @@
       </w:pPr>
       <w:r>
         <w:rPr/>
-        <w:t xml:space="preserve">On the indicators that can be compared reliably, FCI’s financial and physical size has grown well beyond its pre-COVID level. Paid-up capital is up 365.3% (₹4,497 crore to ₹20,924 crore), reflecting continued capital infusion rather than a one-time COVID response. The food subsidy bill, after peaking in the COVID years (₹2,16,869 crore in 2020-21), is now 10.7% above its pre-COVID level. Storage capacity has grown 11.3%, and average utilisation is back at its pre-COVID level of 84%.</w:t>
+        <w:t xml:space="preserve">On the indicators that can be compared reliably, FCI’s financial and physical size has grown well beyond its pre-COVID level. Paid-up capital is up 365.3% (₹4,497 crore to ₹20,924 crore), reflecting continued capital infusion rather than a one-time COVID response; most of the 2024-25 increase is consistent with the ₹10,700 crore equity infusion for working capital approved for 2024-25 (PIB, 2024). The food subsidy bill, after peaking in the COVID years (₹2,16,869 crore in 2020-21), is now 10.7% above its pre-COVID level. Storage capacity has grown 11.3%, and average utilisation is back at its pre-COVID level of 84%.</w:t>
       </w:r>
     </w:p>
     <w:p>
@@ -22358,7 +22551,7 @@
       </w:pPr>
       <w:r>
         <w:rPr/>
-        <w:t xml:space="preserve">National procurement recovered to 559 LMT in 2024-25 but remained 2.9% below 576 LMT in 2022-23, with wheat down 5.1% and rice broadly stable. Procurement-related costs per quintal rose (wheat +19.4%, paddy +33.3%, rice +13.4%) while distribution cost per quintal fell 17.7%, so cost pressure is coming mainly from the procurement side. The Gujarat Region does not procure grain and is assessed through storage and distribution (Section 6.6).</w:t>
+        <w:t xml:space="preserve">National procurement recovered to 559 LMT in 2024-25 but remained 2.9% below 576 LMT in 2022-23, with wheat down 5.1% and rice broadly stable. Procurement-related costs per quintal rose (wheat +19.4%, paddy +33.3%, rice +13.4%) while distribution cost per quintal fell 17.7%, so cost pressure is coming mainly from the procurement side. FCI does not undertake procurement in Gujarat, so the Gujarat Region is assessed through storage and distribution (Section 6.6).</w:t>
       </w:r>
     </w:p>
     <w:p>
@@ -22498,7 +22691,7 @@
       </w:pPr>
       <w:r>
         <w:rPr/>
-        <w:t xml:space="preserve">The Gujarat Region does not procure grain; its role is storage and distribution. On these measures it shows steady growth: storage capacity up about 50% since 2019-20 (6.23 to 9.34 LMT), utilisation of about 91% in the latest years reported, and foodgrain offtake up 18.6% (23.18 to 27.50 lakh tonnes) between 2022-23 and 2024-25. Closing stock grew slightly faster (+21.8%) but was still equal to only about four months of offtake. Several Gujarat figures in the compiled data — 2022-23 capacity, some carried-forward stock values and a coarse grain procurement series — need to be checked against the original reports, which limits how far the regional conclusions can be taken.</w:t>
+        <w:t xml:space="preserve">FCI does not undertake procurement in Gujarat; the Gujarat Region’s role is storage and distribution (MSP procurement within the state is carried out by the State Government through GSCSC). On storage and distribution measures the region shows steady growth: storage capacity up about 50% since 2019-20 (6.23 to 9.34 LMT), utilisation of about 91% in the latest years reported, and foodgrain offtake up 18.6% (23.18 to 27.50 lakh tonnes) between 2022-23 and 2024-25. Closing stock grew slightly faster (+21.8%) but was still equal to only about four months of offtake. Some Gujarat figures in the compiled data — 2022-23 capacity and some carried-forward stock values — need to be checked against the original reports, which limits how far the regional conclusions can be taken.</w:t>
       </w:r>
     </w:p>
     <w:p>
@@ -22816,7 +23009,7 @@
       </w:pPr>
       <w:r>
         <w:rPr/>
-        <w:t xml:space="preserve">For the Gujarat Region, the most meaningful indicators are storage and distribution, since the region does not procure grain. These show steady growth with high utilisation. The study also found that some regional and baseline figures in the compiled dataset need verification, which shows the value of checking secondary data before drawing conclusions. The recommendations in Chapter 7 — better storage planning, seasonal storage contracts, scheduling-based demurrage control and regular KPI monitoring — can largely be implemented within FCI’s existing systems.</w:t>
+        <w:t xml:space="preserve">For the Gujarat Region, the most meaningful indicators are storage and distribution, since FCI does not undertake procurement in Gujarat. These show steady growth with high utilisation. The study also found that some regional and baseline figures in the compiled dataset need verification, which shows the value of checking secondary data before drawing conclusions. The recommendations in Chapter 7 — better storage planning, seasonal storage contracts, scheduling-based demurrage control and regular KPI monitoring — can largely be implemented within FCI’s existing systems.</w:t>
       </w:r>
     </w:p>
     <w:p>
@@ -22877,18 +23070,18 @@
       </w:pPr>
       <w:r>
         <w:rPr/>
-        <w:t xml:space="preserve">Boyne, G. A. (2002). Concepts and indicators of local authority performance: An evaluation of the statutory frameworks in England and Wales. </w:t>
+        <w:t xml:space="preserve">ANI. (2025, November 22). </w:t>
       </w:r>
       <w:r>
         <w:rPr>
           <w:i/>
           <w:iCs/>
         </w:rPr>
-        <w:t xml:space="preserve">Public Money &amp; Management, 22</w:t>
+        <w:t xml:space="preserve">Gujarat govt to start direct procurement of paddy, bajra, jowar, maize, and ragi at MSP from Nov 24</w:t>
       </w:r>
       <w:r>
         <w:rPr/>
-        <w:t xml:space="preserve">(2), 17–24.</w:t>
+        <w:t xml:space="preserve">. https://aninews.in</w:t>
       </w:r>
     </w:p>
     <w:p>
@@ -22900,18 +23093,18 @@
       </w:pPr>
       <w:r>
         <w:rPr/>
-        <w:t xml:space="preserve">Chen, H., Chiang, R. H. L., &amp; Storey, V. C. (2012). Business intelligence and analytics: From big data to big impact. </w:t>
+        <w:t xml:space="preserve">Boyne, G. A. (2002). Concepts and indicators of local authority performance: An evaluation of the statutory frameworks in England and Wales. </w:t>
       </w:r>
       <w:r>
         <w:rPr>
           <w:i/>
           <w:iCs/>
         </w:rPr>
-        <w:t xml:space="preserve">MIS Quarterly, 36</w:t>
+        <w:t xml:space="preserve">Public Money &amp; Management, 22</w:t>
       </w:r>
       <w:r>
         <w:rPr/>
-        <w:t xml:space="preserve">(4), 1165–1188.</w:t>
+        <w:t xml:space="preserve">(2), 17–24.</w:t>
       </w:r>
     </w:p>
     <w:p>
@@ -22923,18 +23116,18 @@
       </w:pPr>
       <w:r>
         <w:rPr/>
-        <w:t xml:space="preserve">Comptroller and Auditor General of India. (2023). </w:t>
+        <w:t xml:space="preserve">Chen, H., Chiang, R. H. L., &amp; Storey, V. C. (2012). Business intelligence and analytics: From big data to big impact. </w:t>
       </w:r>
       <w:r>
         <w:rPr>
           <w:i/>
           <w:iCs/>
         </w:rPr>
-        <w:t xml:space="preserve">Report No. 20 of 2023: Performance audit on storage management and movement of foodgrains in Food Corporation of India</w:t>
+        <w:t xml:space="preserve">MIS Quarterly, 36</w:t>
       </w:r>
       <w:r>
         <w:rPr/>
-        <w:t xml:space="preserve"> (for the year ended March 2022). Government of India.</w:t>
+        <w:t xml:space="preserve">(4), 1165–1188.</w:t>
       </w:r>
     </w:p>
     <w:p>
@@ -22946,18 +23139,18 @@
       </w:pPr>
       <w:r>
         <w:rPr/>
-        <w:t xml:space="preserve">Food and Agriculture Organization of the United Nations. (1996). </w:t>
+        <w:t xml:space="preserve">Comptroller and Auditor General of India. (2023). </w:t>
       </w:r>
       <w:r>
         <w:rPr>
           <w:i/>
           <w:iCs/>
         </w:rPr>
-        <w:t xml:space="preserve">Rome Declaration on World Food Security and World Food Summit Plan of Action</w:t>
+        <w:t xml:space="preserve">Report No. 20 of 2023: Performance audit on storage management and movement of foodgrains in Food Corporation of India</w:t>
       </w:r>
       <w:r>
         <w:rPr/>
-        <w:t xml:space="preserve">. FAO.</w:t>
+        <w:t xml:space="preserve"> (for the year ended March 2022). Government of India.</w:t>
       </w:r>
     </w:p>
     <w:p>
@@ -22969,14 +23162,14 @@
       </w:pPr>
       <w:r>
         <w:rPr/>
-        <w:t xml:space="preserve">Food and Agriculture Organization of the United Nations. (2001). </w:t>
+        <w:t xml:space="preserve">Food and Agriculture Organization of the United Nations. (1996). </w:t>
       </w:r>
       <w:r>
         <w:rPr>
           <w:i/>
           <w:iCs/>
         </w:rPr>
-        <w:t xml:space="preserve">The State of Food Insecurity in the World 2001</w:t>
+        <w:t xml:space="preserve">Rome Declaration on World Food Security and World Food Summit Plan of Action</w:t>
       </w:r>
       <w:r>
         <w:rPr/>
@@ -22992,18 +23185,18 @@
       </w:pPr>
       <w:r>
         <w:rPr/>
-        <w:t xml:space="preserve">Food Corporation of India. (2023). </w:t>
+        <w:t xml:space="preserve">Food and Agriculture Organization of the United Nations. (2001). </w:t>
       </w:r>
       <w:r>
         <w:rPr>
           <w:i/>
           <w:iCs/>
         </w:rPr>
-        <w:t xml:space="preserve">Annual Report 2022-23</w:t>
+        <w:t xml:space="preserve">The State of Food Insecurity in the World 2001</w:t>
       </w:r>
       <w:r>
         <w:rPr/>
-        <w:t xml:space="preserve"> (59th Annual Report). Ministry of Consumer Affairs, Food and Public Distribution, Government of India.</w:t>
+        <w:t xml:space="preserve">. FAO.</w:t>
       </w:r>
     </w:p>
     <w:p>
@@ -23015,18 +23208,18 @@
       </w:pPr>
       <w:r>
         <w:rPr/>
-        <w:t xml:space="preserve">Food Corporation of India. (2024). </w:t>
+        <w:t xml:space="preserve">Food Corporation of India. (2023). </w:t>
       </w:r>
       <w:r>
         <w:rPr>
           <w:i/>
           <w:iCs/>
         </w:rPr>
-        <w:t xml:space="preserve">Annual Report 2023-24</w:t>
+        <w:t xml:space="preserve">Annual Report 2022-23</w:t>
       </w:r>
       <w:r>
         <w:rPr/>
-        <w:t xml:space="preserve"> (60th Annual Report). Ministry of Consumer Affairs, Food and Public Distribution, Government of India.</w:t>
+        <w:t xml:space="preserve"> (59th Annual Report). Ministry of Consumer Affairs, Food and Public Distribution, Government of India.</w:t>
       </w:r>
     </w:p>
     <w:p>
@@ -23038,18 +23231,18 @@
       </w:pPr>
       <w:r>
         <w:rPr/>
-        <w:t xml:space="preserve">Food Corporation of India. (2025). </w:t>
+        <w:t xml:space="preserve">Food Corporation of India. (2024). </w:t>
       </w:r>
       <w:r>
         <w:rPr>
           <w:i/>
           <w:iCs/>
         </w:rPr>
-        <w:t xml:space="preserve">Annual Report 2024-25</w:t>
+        <w:t xml:space="preserve">Annual Report 2023-24</w:t>
       </w:r>
       <w:r>
         <w:rPr/>
-        <w:t xml:space="preserve"> (61st Annual Report). Ministry of Consumer Affairs, Food and Public Distribution, Government of India.</w:t>
+        <w:t xml:space="preserve"> (60th Annual Report). Ministry of Consumer Affairs, Food and Public Distribution, Government of India.</w:t>
       </w:r>
     </w:p>
     <w:p>
@@ -23061,18 +23254,18 @@
       </w:pPr>
       <w:r>
         <w:rPr/>
-        <w:t xml:space="preserve">Food Corporation of India. (n.d.). </w:t>
+        <w:t xml:space="preserve">Food Corporation of India. (2025). </w:t>
       </w:r>
       <w:r>
         <w:rPr>
           <w:i/>
           <w:iCs/>
         </w:rPr>
-        <w:t xml:space="preserve">Citizen’s Charter</w:t>
+        <w:t xml:space="preserve">Annual Report 2024-25</w:t>
       </w:r>
       <w:r>
         <w:rPr/>
-        <w:t xml:space="preserve">. https://fci.gov.in</w:t>
+        <w:t xml:space="preserve"> (61st Annual Report). Ministry of Consumer Affairs, Food and Public Distribution, Government of India.</w:t>
       </w:r>
     </w:p>
     <w:p>
@@ -23084,14 +23277,14 @@
       </w:pPr>
       <w:r>
         <w:rPr/>
-        <w:t xml:space="preserve">Food Corporation of India. (2026). </w:t>
+        <w:t xml:space="preserve">Food Corporation of India. (n.d.). </w:t>
       </w:r>
       <w:r>
         <w:rPr>
           <w:i/>
           <w:iCs/>
         </w:rPr>
-        <w:t xml:space="preserve">Official website</w:t>
+        <w:t xml:space="preserve">Citizen’s Charter</w:t>
       </w:r>
       <w:r>
         <w:rPr/>
@@ -23106,18 +23299,18 @@
       </w:pPr>
       <w:r>
         <w:rPr/>
-        <w:t xml:space="preserve">Government of India. (2013). </w:t>
+        <w:t xml:space="preserve">Food Corporation of India. (2026). </w:t>
       </w:r>
       <w:r>
         <w:rPr>
           <w:i/>
           <w:iCs/>
         </w:rPr>
-        <w:t xml:space="preserve">The National Food Security Act, 2013</w:t>
+        <w:t xml:space="preserve">Official website</w:t>
       </w:r>
       <w:r>
         <w:rPr/>
-        <w:t xml:space="preserve"> (No. 20 of 2013).</w:t>
+        <w:t xml:space="preserve">. https://fci.gov.in</w:t>
       </w:r>
     </w:p>
     <w:p>
@@ -23129,18 +23322,18 @@
       </w:pPr>
       <w:r>
         <w:rPr/>
-        <w:t xml:space="preserve">High Level Committee on Reorienting the Role and Restructuring of Food Corporation of India. (2015). </w:t>
+        <w:t xml:space="preserve">Government of India. (2013). </w:t>
       </w:r>
       <w:r>
         <w:rPr>
           <w:i/>
           <w:iCs/>
         </w:rPr>
-        <w:t xml:space="preserve">Report of the High Level Committee on Reorienting the Role and Restructuring of Food Corporation of India</w:t>
+        <w:t xml:space="preserve">The National Food Security Act, 2013</w:t>
       </w:r>
       <w:r>
         <w:rPr/>
-        <w:t xml:space="preserve"> (Chairman: Shanta Kumar). Government of India.</w:t>
+        <w:t xml:space="preserve"> (No. 20 of 2013).</w:t>
       </w:r>
     </w:p>
     <w:p>
@@ -23152,18 +23345,18 @@
       </w:pPr>
       <w:r>
         <w:rPr/>
-        <w:t xml:space="preserve">Ministry of Finance, Government of India. (2021). </w:t>
+        <w:t xml:space="preserve">Gujarat State Civil Supplies Corporation Ltd. (n.d.). </w:t>
       </w:r>
       <w:r>
         <w:rPr>
           <w:i/>
           <w:iCs/>
         </w:rPr>
-        <w:t xml:space="preserve">Economic Survey 2020-21</w:t>
+        <w:t xml:space="preserve">Foodgrains at MSP</w:t>
       </w:r>
       <w:r>
         <w:rPr/>
-        <w:t xml:space="preserve"> (Vol. 2). Department of Economic Affairs.</w:t>
+        <w:t xml:space="preserve">. https://gscsc.apphost.in/en/procurement</w:t>
       </w:r>
     </w:p>
     <w:p>
@@ -23175,18 +23368,133 @@
       </w:pPr>
       <w:r>
         <w:rPr/>
-        <w:t xml:space="preserve">Press Information Bureau, Government of India. (2023). </w:t>
+        <w:t xml:space="preserve">High Level Committee on Reorienting the Role and Restructuring of Food Corporation of India. (2015). </w:t>
       </w:r>
       <w:r>
         <w:rPr>
           <w:i/>
           <w:iCs/>
         </w:rPr>
+        <w:t xml:space="preserve">Report of the High Level Committee on Reorienting the Role and Restructuring of Food Corporation of India</w:t>
+      </w:r>
+      <w:r>
+        <w:rPr/>
+        <w:t xml:space="preserve"> (Chairman: Shanta Kumar). Government of India.</w:t>
+      </w:r>
+    </w:p>
+    <w:p>
+      <w:pPr>
+        <w:pStyle w:val="BodyText"/>
+        <w:spacing w:line="360" w:lineRule="auto"/>
+        <w:ind w:left="720" w:hanging="720"/>
+        <w:jc w:val="both"/>
+      </w:pPr>
+      <w:r>
+        <w:rPr/>
+        <w:t xml:space="preserve">Krishi Jagran. (2023, March 4). </w:t>
+      </w:r>
+      <w:r>
+        <w:rPr>
+          <w:i/>
+          <w:iCs/>
+        </w:rPr>
+        <w:t xml:space="preserve">Govt’s millet procurement may be less than expected; only 17% of approved quantity procured</w:t>
+      </w:r>
+      <w:r>
+        <w:rPr/>
+        <w:t xml:space="preserve">. https://krishijagran.com</w:t>
+      </w:r>
+    </w:p>
+    <w:p>
+      <w:pPr>
+        <w:pStyle w:val="BodyText"/>
+        <w:spacing w:line="360" w:lineRule="auto"/>
+        <w:ind w:left="720" w:hanging="720"/>
+        <w:jc w:val="both"/>
+      </w:pPr>
+      <w:r>
+        <w:rPr/>
+        <w:t xml:space="preserve">Kumar, A., Dey, K., &amp; Gupta, K. B. (2023). Food Corporation of India: Making public procurement more inclusive and efficient. </w:t>
+      </w:r>
+      <w:r>
+        <w:rPr>
+          <w:i/>
+          <w:iCs/>
+        </w:rPr>
+        <w:t xml:space="preserve">Asian Journal of Management Cases</w:t>
+      </w:r>
+      <w:r>
+        <w:rPr/>
+        <w:t xml:space="preserve">. https://doi.org/10.1177/09728201231168246</w:t>
+      </w:r>
+    </w:p>
+    <w:p>
+      <w:pPr>
+        <w:pStyle w:val="BodyText"/>
+        <w:spacing w:line="360" w:lineRule="auto"/>
+        <w:ind w:left="720" w:hanging="720"/>
+        <w:jc w:val="both"/>
+      </w:pPr>
+      <w:r>
+        <w:rPr/>
+        <w:t xml:space="preserve">Ministry of Finance, Government of India. (2021). </w:t>
+      </w:r>
+      <w:r>
+        <w:rPr>
+          <w:i/>
+          <w:iCs/>
+        </w:rPr>
+        <w:t xml:space="preserve">Economic Survey 2020-21</w:t>
+      </w:r>
+      <w:r>
+        <w:rPr/>
+        <w:t xml:space="preserve"> (Vol. 2). Department of Economic Affairs.</w:t>
+      </w:r>
+    </w:p>
+    <w:p>
+      <w:pPr>
+        <w:pStyle w:val="BodyText"/>
+        <w:spacing w:line="360" w:lineRule="auto"/>
+        <w:ind w:left="720" w:hanging="720"/>
+        <w:jc w:val="both"/>
+      </w:pPr>
+      <w:r>
+        <w:rPr/>
+        <w:t xml:space="preserve">Press Information Bureau, Government of India. (2023). </w:t>
+      </w:r>
+      <w:r>
+        <w:rPr>
+          <w:i/>
+          <w:iCs/>
+        </w:rPr>
         <w:t xml:space="preserve">Cabinet approves Minimum Support Prices (MSP) for all Rabi crops for marketing season 2024-25</w:t>
       </w:r>
       <w:r>
         <w:rPr/>
         <w:t xml:space="preserve"> [Press release]. pib.gov.in</w:t>
+      </w:r>
+    </w:p>
+    <w:p>
+      <w:pPr>
+        <w:pStyle w:val="BodyText"/>
+        <w:spacing w:line="360" w:lineRule="auto"/>
+        <w:ind w:left="720" w:hanging="720"/>
+        <w:jc w:val="both"/>
+      </w:pPr>
+      <w:r>
+        <w:rPr/>
+        <w:t xml:space="preserve">Press Information Bureau, Government of India. (2024, November 23). </w:t>
+      </w:r>
+      <w:r>
+        <w:rPr>
+          <w:i/>
+          <w:iCs/>
+        </w:rPr>
+        <w:t xml:space="preserve">India’s food security: Transformative role of Food Corporation of India (FCI)</w:t>
+      </w:r>
+      <w:r>
+        <w:rPr/>
+        <w:t xml:space="preserve"> [Backgrounder]. pib.gov.in</w:t>
       </w:r>
     </w:p>
     <w:p>

</xml_diff>